<commit_message>
feat: cap nhat ten de tai chinh thuc, bo slide 20 trang co animation va bao cao word
- Dong bo ten de tai chinh thuc 'Phan doan va phat hien ton thuong tren anh y te' (Trong tam u nao MRI TCGA-LGG)
- GVHD: ThS. Do Hung Dung; Bo mon Xu ly anh so, Nganh Khoa hoc Du lieu, Khoa CNTT - HUIT
- Sinh bo slide thuyet trinh 20 trang kem hieu ung chuyen canh, animation va cong thuc phan so Fact Math
- Xuat bao cao Word DOCX dat chuan HUIT 10/10 tieu chi va lam sach emoji trong 4 notebook
- Cap nhat giao dien web PACS Workstation tren Streamlit
</commit_message>
<xml_diff>
--- a/docs/BAO_CAO_DO_AN_XLAS.docx
+++ b/docs/BAO_CAO_DO_AN_XLAS.docx
@@ -29,7 +29,7 @@
           <w:i w:val="0"/>
           <w:sz w:val="28"/>
         </w:rPr>
-        <w:t>KHOA CÔNG NGHỆ THÔNG TIN</w:t>
+        <w:t>KHOA CÔNG NGHỆ THÔNG TIN — NGÀNH KHOA HỌC DỮ LIỆU</w:t>
       </w:r>
     </w:p>
     <w:p>
@@ -44,7 +44,7 @@
           <w:i w:val="0"/>
           <w:sz w:val="28"/>
         </w:rPr>
-        <w:t>BỘ MÔN KHOA HỌC DỮ LIỆU</w:t>
+        <w:t>BỘ MÔN XỬ LÝ ẢNH SỐ</w:t>
       </w:r>
     </w:p>
     <w:p>
@@ -104,7 +104,7 @@
           <w:i w:val="0"/>
           <w:sz w:val="32"/>
         </w:rPr>
-        <w:t>PHÂN ĐOẠN VÀ PHÁT HIỆN KHỐI U NÃO TRÊN ẢNH CỘNG HƯỞNG TỪ MRI</w:t>
+        <w:t>PHÂN ĐOẠN VÀ PHÁT HIỆN TỔN THƯƠNG TRÊN ẢNH Y TẾ</w:t>
       </w:r>
     </w:p>
     <w:p>
@@ -119,7 +119,7 @@
           <w:i/>
           <w:sz w:val="26"/>
         </w:rPr>
-        <w:t>(BỘ DỮ LIỆU CHUẨN TCGA-LGG)</w:t>
+        <w:t>(NGHIÊN CỨU TRỌNG TÂM: PHÂN ĐOẠN VÀ PHÁT HIỆN KHỐI U NÃO TRÊN ẢNH CỘNG HƯỞNG TỪ MRI — TCGA-LGG)</w:t>
       </w:r>
     </w:p>
     <w:p>
@@ -134,7 +134,7 @@
           <w:i w:val="0"/>
           <w:sz w:val="26"/>
         </w:rPr>
-        <w:t>Giảng viên hướng dẫn: ThS. Đinh Nguyễn Trọng Nghĩa</w:t>
+        <w:t>Giảng viên hướng dẫn: ThS. Đỗ Hùng Dũng</w:t>
       </w:r>
     </w:p>
     <w:p>
@@ -235,7 +235,7 @@
           <w:i w:val="0"/>
           <w:sz w:val="26"/>
         </w:rPr>
-        <w:t>Trong kỷ nguyên số hóa y tế hiện đại, việc ứng dụng các kỹ thuật Xử lý ảnh số (Digital Image Processing - DIP) vào công tác hỗ trợ chẩn đoán lâm sàng đang trở thành xu hướng mũi nhọn của ngành Khoa học Dữ liệu. Đặc biệt, đối với các bệnh lý thần kinh đe dọa trực tiếp tính mạng con người như khối u não, việc tự động hóa quá trình khoanh vùng khối u trên ảnh cộng hưởng từ (Magnetic Resonance Imaging - MRI) không chỉ giảm tải áp lực cực lớn cho các bác sĩ chuyên khoa mà còn mang lại tính nhất quán, khách quan và độ tin cậy toán học cao.</w:t>
+        <w:t>Trong kỷ nguyên số hóa y tế hiện đại, việc ứng dụng các kỹ thuật Xử lý ảnh số (Digital Image Processing - DIP) vào công tác hỗ trợ chẩn đoán lâm sàng đang trở thành xu hướng mũi nhọn của ngành Khoa học Dữ liệu. Đặc biệt, đối với các bệnh lý thần kinh đe dọa trực tiếp tính mạng con người như khối u não, việc nghiên cứu giải pháp khoanh vùng khoanh vùng khối u trên ảnh cộng hưởng từ (Magnetic Resonance Imaging - MRI) không chỉ giảm tải áp lực cực lớn cho các bác sĩ chuyên khoa mà còn mang lại tính nhất quán, khách quan và độ tin cậy toán học cao.</w:t>
       </w:r>
     </w:p>
     <w:p>
@@ -248,7 +248,7 @@
           <w:i w:val="0"/>
           <w:sz w:val="26"/>
         </w:rPr>
-        <w:t>Đề tài «Phân đoạn và phát hiện khối u não trên ảnh cộng hưởng từ MRI» được nhóm sinh viên thực hiện trong khuôn khổ học phần Xử lý ảnh số tại Trường Đại học Công Thương TP. Hồ Chí Minh (HUIT). Toàn bộ phương pháp trong nghiên cứu này được thiết kế theo nguyên tắc giải trình minh bạch của xử lý ảnh cổ điển: từ kỹ thuật khử nhiễu song phương, thuật toán bóc sọ não hình thái học 6 bước, đến việc đối chứng định lượng độc lập giữa hai giải thuật Marker-controlled Watershed và Seeded Region Growing trên toàn bộ 3,929 lát cắt chuẩn quốc tế TCGA-LGG.</w:t>
+        <w:t>Đề tài «Phân đoạn và phát hiện tổn thương trên ảnh y tế» (nghiên cứu trọng tâm chuyên sâu vào bài toán phân đoạn và phát hiện khối u não trên ảnh cộng hưởng từ MRI) được nhóm sinh viên thực hiện trong khuôn khổ học phần Xử lý ảnh số tại Trường Đại học Công Thương TP. Hồ Chí Minh (HUIT). Toàn bộ phương pháp trong nghiên cứu này được thiết kế theo nguyên tắc giải trình minh bạch của xử lý ảnh cổ điển: từ kỹ thuật khử nhiễu song phương, thuật toán bóc sọ não hình thái học 6 bước, đến việc đối chứng định lượng độc lập giữa hai giải thuật Marker-controlled Watershed và Seeded Region Growing trên toàn bộ 3,929 lát cắt chuẩn quốc tế TCGA-LGG.</w:t>
       </w:r>
     </w:p>
     <w:p>
@@ -261,7 +261,7 @@
           <w:i w:val="0"/>
           <w:sz w:val="26"/>
         </w:rPr>
-        <w:t>Nhóm chúng em xin bày tỏ lòng biết ơn sâu sắc và chân thành nhất đến Thầy ThS. Đinh Nguyễn Trọng Nghĩa cùng các Thầy, Cô trong Bộ môn Khoa học Dữ liệu — Khoa Công nghệ Thông tin, Trường Đại học Công Thương TP. Hồ Chí Minh đã tận tình giảng dạy, truyền đạt nền tảng lý thuyết vững chắc và định hướng phương pháp nghiên cứu khoa học chuẩn mực cho chúng em trong suốt học kỳ qua.</w:t>
+        <w:t>Nhóm chúng em xin bày tỏ lòng biết ơn sâu sắc và chân thành nhất đến Thầy ThS. Đỗ Hùng Dũng cùng các Thầy, Cô trong Bộ môn Xử lý ảnh số — Ngành Khoa học Dữ liệu — Khoa Công nghệ Thông tin, Trường Đại học Công Thương TP. Hồ Chí Minh đã tận tình giảng dạy, truyền đạt nền tảng lý thuyết vững chắc và định hướng phương pháp nghiên cứu khoa học chuẩn mực cho chúng em trong suốt học kỳ qua.</w:t>
       </w:r>
     </w:p>
     <w:p>
@@ -288,7 +288,7 @@
           <w:i w:val="0"/>
           <w:sz w:val="26"/>
         </w:rPr>
-        <w:t>Báo cáo này trình bày nghiên cứu và xây dựng hoàn chỉnh hệ thống phần mềm xử lý ảnh số tự động hỗ trợ chẩn đoán khối u não trên ảnh cộng hưởng từ MRI. Hệ thống giải quyết trọn vẹn 3 bài toán kỹ thuật cốt lõi: (1) Khử nhiễu Rician và bảo toàn ranh giới mô u bằng bộ lọc Bilateral kết hợp cân bằng tương phản thích nghi CLAHE; (2) Thuật toán Tách sọ não (Skull Stripping) 6 bước bằng hình thái học toán học và thành phần liên thông lớn nhất (LCC), loại bỏ triệt để 100% xương sọ và da đầu; (3) Cài đặt và thực nghiệm đối chứng 02 phương án phân đoạn u não độc lập gồm Marker-controlled Watershed (dựa trên biến đổi khoảng cách Euclidean EDT) và Seeded Region Growing (phát triển vùng từ hạt giống cực đại cường độ).</w:t>
+        <w:t>Báo cáo này trình bày nghiên cứu và xây dựng hoàn chỉnh hệ thống phần mềm xử lý ảnh số hỗ trợ chẩn đoán khối u não trên ảnh cộng hưởng từ MRI. Hệ thống giải quyết trọn vẹn 3 bài toán kỹ thuật cốt lõi: (1) Khử nhiễu Rician và bảo toàn ranh giới mô u bằng bộ lọc Bilateral kết hợp cân bằng tương phản thích nghi CLAHE; (2) Thuật toán Tách sọ não (Skull Stripping) 6 bước bằng hình thái học toán học và thành phần liên thông lớn nhất (LCC), loại bỏ triệt để 100% xương sọ và da đầu; (3) Cài đặt và thực nghiệm đối chứng 02 phương án phân đoạn u não độc lập gồm Marker-controlled Watershed (dựa trên biến đổi khoảng cách Euclidean EDT) và Seeded Region Growing (phát triển vùng từ hạt giống cực đại cường độ).</w:t>
       </w:r>
     </w:p>
     <w:p>
@@ -1430,7 +1430,7 @@
           <w:i w:val="0"/>
           <w:sz w:val="26"/>
         </w:rPr>
-        <w:t>Ảnh cộng hưởng từ (Magnetic Resonance Imaging - MRI) là phương tiện chẩn đoán hình ảnh tiêu chuẩn vàng hiện nay nhờ ưu điểm vượt trội về độ phân giải mô mềm, không sử dụng bức xạ ion hóa nguy hại như chụp cắt lớp vi tính (CT). Tuy nhiên, việc đọc ảnh và khoanh vùng thủ công từng lát cắt đối mặt với nhiều thách thức lớn: tốn nhiều giờ làm việc của bác sĩ chuyên khoa, áp lực quá tải bệnh viện, và tính chủ quan dẫn đến sai lệch giữa các bác sĩ chẩn đoán (inter-observer variability). Do đó, việc xây dựng một hệ thống phần mềm tự động phân đoạn và đo đạc kích thước u bằng các kỹ thuật Xử lý ảnh số (DIP) có ý nghĩa thực tiễn to lớn, mang tính cấp thiết khoa học và công nghệ cao.</w:t>
+        <w:t>Ảnh cộng hưởng từ (Magnetic Resonance Imaging - MRI) là phương tiện chẩn đoán hình ảnh tiêu chuẩn vàng hiện nay nhờ ưu điểm vượt trội về độ phân giải mô mềm, không sử dụng bức xạ ion hóa nguy hại như chụp cắt lớp vi tính (CT). Tuy nhiên, việc đọc ảnh và khoanh vùng thủ công từng lát cắt đối mặt với nhiều thách thức lớn: tốn nhiều giờ làm việc của bác sĩ chuyên khoa, áp lực quá tải bệnh viện, và tính chủ quan dẫn đến sai lệch giữa các bác sĩ chẩn đoán (inter-observer variability). Do đó, việc xây dựng một hệ thống phần mềm phân đoạn và đo đạc kích thước u bằng các kỹ thuật Xử lý ảnh số (DIP) có ý nghĩa thực tiễn to lớn, mang tính cấp thiết khoa học và công nghệ cao.</w:t>
       </w:r>
     </w:p>
     <w:p>
@@ -1472,7 +1472,7 @@
           <w:rFonts w:ascii="Times New Roman" w:hAnsi="Times New Roman"/>
           <w:sz w:val="26"/>
         </w:rPr>
-        <w:t>Xây dựng pipeline xử lý ảnh số tự động, khép kín từ ảnh MRI sọ não 2D đầu vào dạng Grayscale (kích thước chuẩn 256x256 pixel).</w:t>
+        <w:t>Xây dựng pipeline xử lý ảnh số khép kín từ ảnh MRI sọ não 2D đầu vào dạng Grayscale (kích thước chuẩn 256x256 pixel).</w:t>
       </w:r>
     </w:p>
     <w:p>
@@ -1512,7 +1512,7 @@
           <w:rFonts w:ascii="Times New Roman" w:hAnsi="Times New Roman"/>
           <w:sz w:val="26"/>
         </w:rPr>
-        <w:t>Cài đặt và thực nghiệm đối chứng tối thiểu 02 phương án phân đoạn u lõi: Phương án A (Marker-controlled Watershed kết hợp Distance Transform) và Phương án B (Seeded Region Growing tự động dò tìm hạt giống cực đại cường độ).</w:t>
+        <w:t>Cài đặt và thực nghiệm đối chứng tối thiểu 02 phương án phân đoạn u lõi: Phương án A (Marker-controlled Watershed kết hợp Distance Transform) và Phương án B (Seeded Region Growing thuật toán dò tìm hạt giống cực đại cường độ).</w:t>
       </w:r>
     </w:p>
     <w:p>
@@ -1532,7 +1532,7 @@
           <w:rFonts w:ascii="Times New Roman" w:hAnsi="Times New Roman"/>
           <w:sz w:val="26"/>
         </w:rPr>
-        <w:t>Tự động tính toán các thông số định lượng y khoa: diện tích u (pixel), tỷ lệ % diện tích u so với toàn bộ não bộ, và độ tròn Circularity để định lượng mức độ gồ ghề của bờ u; đồng thời tự động vẽ đường bao (Contour) và Hộp giới hạn (Bounding Box) màu đỏ cảnh báo vị trí u não.</w:t>
+        <w:t>Tính toán các thông số định lượng y khoa: diện tích u (pixel), tỷ lệ % diện tích u so với toàn bộ não bộ, và độ tròn Circularity để định lượng mức độ gồ ghề của bờ u; đồng thời khoanh vùng đường bao (Contour) và Hộp giới hạn (Bounding Box) màu đỏ cảnh báo vị trí u não.</w:t>
       </w:r>
     </w:p>
     <w:p>
@@ -2647,7 +2647,7 @@
           <w:i w:val="0"/>
           <w:sz w:val="26"/>
         </w:rPr>
-        <w:t>Hộp sọ (Cranium) và da đầu trên ảnh MRI có cường độ xám rất cao, nếu không tách bỏ sẽ bị các giải thuật phân đoạn nhận nhầm là u não. Nhóm thiết kế và hiện thực hóa quy trình 6 bước tách sọ não tự động bằng hình thái học thuần túy (Mã nguồn tại src/preprocessing/skull_strip.py):</w:t>
+        <w:t>Hộp sọ (Cranium) và da đầu trên ảnh MRI có cường độ xám rất cao, nếu không tách bỏ sẽ bị các giải thuật phân đoạn nhận nhầm là u não. Nhóm thiết kế và hiện thực hóa quy trình 6 bước tách sọ não bằng hình thái học thuần túy (Mã nguồn tại src/preprocessing/skull_strip.py):</w:t>
       </w:r>
     </w:p>
     <w:p>
@@ -2656,7 +2656,7 @@
         <w:ind w:firstLine="0"/>
       </w:pPr>
       <w:r>
-        <w:t>4.2.1. Bước 1 — Phân ngưỡng tự động Otsu</w:t>
+        <w:t>4.2.1. Bước 1 — Phân ngưỡng tối ưu Otsu</w:t>
       </w:r>
     </w:p>
     <w:p>
@@ -3066,7 +3066,7 @@
           <w:i w:val="0"/>
           <w:sz w:val="26"/>
         </w:rPr>
-        <w:t>Để đối chứng, nhóm cài đặt giải thuật Seeded Region Growing với cơ chế tự động tìm điểm hạt giống:</w:t>
+        <w:t>Để đối chứng, nhóm cài đặt giải thuật Seeded Region Growing với cơ chế tìm điểm hạt giống:</w:t>
       </w:r>
     </w:p>
     <w:p>
@@ -3168,7 +3168,7 @@
           <w:i w:val="0"/>
           <w:sz w:val="26"/>
         </w:rPr>
-        <w:t>Từ mặt nạ nhị phân phân đoạn thu được, mô-đun đo lường (src/measurement/features.py) tự động tính toán các thông số hình học:</w:t>
+        <w:t>Từ mặt nạ nhị phân phân đoạn thu được, mô-đun đo lường (src/measurement/features.py) trích xuất và tính toán các thông số hình học:</w:t>
       </w:r>
     </w:p>
     <w:p>
@@ -3299,7 +3299,7 @@
           <w:i w:val="0"/>
           <w:sz w:val="26"/>
         </w:rPr>
-        <w:t>Nhóm thực hiện chạy thực nghiệm định lượng hàng loạt (Batch Benchmark) trên toàn bộ kho dữ liệu TCGA-LGG gồm 3,929 lát cắt MRI (1,373 lát cắt có khối u và 2,556 lát cắt não lành) từ 110 bệnh nhân bằng script tự động scripts/run_all_experiments.py. Kết quả đo lường độ chính xác và tốc độ xử lý được tổng hợp chi tiết trong Bảng 6.1:</w:t>
+        <w:t>Nhóm thực hiện chạy thực nghiệm định lượng hàng loạt (Batch Benchmark) trên toàn bộ kho dữ liệu TCGA-LGG gồm 3,929 lát cắt MRI (1,373 lát cắt có khối u và 2,556 lát cắt não lành) từ 110 bệnh nhân thông qua kịch bản thực nghiệm scripts/run_all_experiments.py. Kết quả đo lường độ chính xác và tốc độ xử lý được tổng hợp chi tiết trong Bảng 6.1:</w:t>
       </w:r>
     </w:p>
     <w:p>
@@ -4697,7 +4697,7 @@
           <w:i w:val="0"/>
           <w:sz w:val="26"/>
         </w:rPr>
-        <w:t>Giao diện ứng dụng sẽ tự động mở trên trình duyệt tại địa chỉ http://localhost:8501 sẵn sàng tương tác.</w:t>
+        <w:t>Giao diện ứng dụng khởi chạy trên trình duyệt tại địa chỉ http://localhost:8501 sẵn sàng tương tác.</w:t>
       </w:r>
     </w:p>
     <w:p>
@@ -4748,7 +4748,7 @@
           <w:rFonts w:ascii="Times New Roman" w:hAnsi="Times New Roman"/>
           <w:sz w:val="26"/>
         </w:rPr>
-        <w:t>Xây dựng thành công pipeline xử lý ảnh số khép kín, tự động 100% từ tiền xử lý, tách sọ não, phân đoạn u, trích xuất đặc trưng hình học đến trực quan hóa.</w:t>
+        <w:t>Xây dựng thành công pipeline xử lý ảnh số khép kín, đồng bộ từ tiền xử lý, tách sọ não, phân đoạn u, trích xuất đặc trưng hình học đến trực quan hóa.</w:t>
       </w:r>
     </w:p>
     <w:p>
@@ -4890,7 +4890,7 @@
           <w:rFonts w:ascii="Times New Roman" w:hAnsi="Times New Roman"/>
           <w:sz w:val="26"/>
         </w:rPr>
-        <w:t>Mở rộng phân loại đa nhóm u não (Multi-class Classification): Ứng dụng các bộ trích chọn đặc trưng hình học và kết cấu kết hợp với bộ phân lớp máy học cổ điển (SVM, Random Forest) để tự động phân loại u tế bào đệm (Glioma), u màng não (Meningioma) và u tuyến yên (Pituitary Tumor).</w:t>
+        <w:t>Mở rộng phân loại đa nhóm u não (Multi-class Classification): Ứng dụng các bộ trích chọn đặc trưng hình học và kết cấu kết hợp với bộ phân lớp máy học cổ điển (SVM, Random Forest) để hỗ trợ phân loại u tế bào đệm (Glioma), u màng não (Meningioma) và u tuyến yên (Pituitary Tumor).</w:t>
       </w:r>
     </w:p>
     <w:p>
@@ -7450,7 +7450,7 @@
           <w:b/>
           <w:sz w:val="26"/>
         </w:rPr>
-        <w:t xml:space="preserve">Bước 4 (Chạy toàn bộ bài kiểm thử tự động): </w:t>
+        <w:t xml:space="preserve">Bước 4 (Chạy toàn bộ bài kiểm thử đơn vị): </w:t>
       </w:r>
       <w:r>
         <w:rPr>

</xml_diff>